<commit_message>
Títulos de párrafo en negrita y nueva justificación del clustering espectral
Co-Authored-By: Claude Opus 5.5 <noreply@anthropic.com>
</commit_message>
<xml_diff>
--- a/Informe_TP1_Clustering_Espectral.docx
+++ b/Informe_TP1_Clustering_Espectral.docx
@@ -4048,8 +4048,16 @@
       <w:r>
         <w:rPr>
           <w:lang w:val="es-CL"/>
-        </w:rPr>
-        <w:t xml:space="preserve">Demostración de la identidad. Por un lado, </w:t>
+          <w:b/>
+          <w:bCs/>
+        </w:rPr>
+        <w:t xml:space="preserve">Demostración de la identidad.</w:t>
+      </w:r>
+      <w:r>
+        <w:rPr>
+          <w:lang w:val="es-CL"/>
+        </w:rPr>
+        <w:t xml:space="preserve"> Por un lado, </w:t>
       </w:r>
       <m:oMath>
         <m:sSup>
@@ -13828,8 +13836,16 @@
       <w:r>
         <w:rPr>
           <w:lang w:val="es-CL"/>
-        </w:rPr>
-        <w:t xml:space="preserve">Fuente. </w:t>
+          <w:b/>
+          <w:bCs/>
+        </w:rPr>
+        <w:t xml:space="preserve">Fuente.</w:t>
+      </w:r>
+      <w:r>
+        <w:rPr>
+          <w:lang w:val="es-CL"/>
+        </w:rPr>
+        <w:t xml:space="preserve"> </w:t>
       </w:r>
       <w:r>
         <w:rPr>
@@ -13856,6 +13872,10 @@
         <w:pStyle w:val="Textoindependiente"/>
       </w:pPr>
       <w:r>
+        <w:rPr>
+          <w:b/>
+          <w:bCs/>
+        </w:rPr>
         <w:t>La red.</w:t>
       </w:r>
     </w:p>
@@ -13934,8 +13954,16 @@
       <w:r>
         <w:rPr>
           <w:lang w:val="es-CL"/>
-        </w:rPr>
-        <w:t xml:space="preserve">Pregunta de análisis. </w:t>
+          <w:b/>
+          <w:bCs/>
+        </w:rPr>
+        <w:t xml:space="preserve">Pregunta de análisis.</w:t>
+      </w:r>
+      <w:r>
+        <w:rPr>
+          <w:lang w:val="es-CL"/>
+        </w:rPr>
+        <w:t xml:space="preserve"> </w:t>
       </w:r>
       <w:r>
         <w:rPr>
@@ -14035,8 +14063,36 @@
       <w:r>
         <w:rPr>
           <w:lang w:val="es-CL"/>
-        </w:rPr>
-        <w:t>Por qué clustering espectral. No sabemos de antemano cuántos grupos hay y solo tenemos similitudes entre países. El espectro indica directamente si la red se separa en bloques, cuántos grupos hay y qué países están en la frontera.</w:t>
+          <w:b/>
+          <w:bCs/>
+        </w:rPr>
+        <w:t xml:space="preserve">¿Por qué clustering espectral?</w:t>
+      </w:r>
+      <w:r>
+        <w:rPr>
+          <w:lang w:val="es-CL"/>
+          <w:b w:val="0"/>
+          <w:bCs w:val="0"/>
+        </w:rPr>
+        <w:t xml:space="preserve"> Cada país tiene un perfil de más de 23 mil canciones, y como casi todos comparten los éxitos globales, agrupar esos perfiles directamente separa mal a los países. Es más natural representarlos como una red de similitudes y buscar comunidades en ella. El clustering espectral hace eso: el espectro del Laplaciano indica si la red se separa en bloques y cuántos grupos sugiere (</w:t>
+      </w:r>
+      <w:r>
+        <w:rPr>
+          <w:lang w:val="es-CL"/>
+          <w:b w:val="0"/>
+          <w:bCs w:val="0"/>
+          <w:i/>
+          <w:iCs/>
+        </w:rPr>
+        <w:t xml:space="preserve">eigengap</w:t>
+      </w:r>
+      <w:r>
+        <w:rPr>
+          <w:lang w:val="es-CL"/>
+          <w:b w:val="0"/>
+          <w:bCs w:val="0"/>
+        </w:rPr>
+        <w:t xml:space="preserve">), sin fijar ese número de antemano, y sus vectores propios entregan una representación de pocas dimensiones donde los grupos quedan separados.</w:t>
       </w:r>
     </w:p>
     <w:p>
@@ -14070,6 +14126,10 @@
         <w:pStyle w:val="FirstParagraph"/>
       </w:pPr>
       <w:r>
+        <w:rPr>
+          <w:b/>
+          <w:bCs/>
+        </w:rPr>
         <w:t>Decisiones de preprocesamiento.</w:t>
       </w:r>
     </w:p>
@@ -14173,8 +14233,16 @@
       <w:r>
         <w:rPr>
           <w:lang w:val="es-CL"/>
-        </w:rPr>
-        <w:t xml:space="preserve">Perfiles y similitud. Cada país </w:t>
+          <w:b/>
+          <w:bCs/>
+        </w:rPr>
+        <w:t xml:space="preserve">Perfiles y similitud.</w:t>
+      </w:r>
+      <w:r>
+        <w:rPr>
+          <w:lang w:val="es-CL"/>
+        </w:rPr>
+        <w:t xml:space="preserve"> Cada país </w:t>
       </w:r>
       <m:oMath>
         <m:r>
@@ -14508,8 +14576,16 @@
       <w:r>
         <w:rPr>
           <w:lang w:val="es-CL"/>
-        </w:rPr>
-        <w:t xml:space="preserve">Construcción de la red. Casi todos los países comparten algún éxito global, así que conectar a todos con todos diluye la estructura. Se conectó cada país con sus </w:t>
+          <w:b/>
+          <w:bCs/>
+        </w:rPr>
+        <w:t xml:space="preserve">Construcción de la red.</w:t>
+      </w:r>
+      <w:r>
+        <w:rPr>
+          <w:lang w:val="es-CL"/>
+        </w:rPr>
+        <w:t xml:space="preserve"> Casi todos los países comparten algún éxito global, así que conectar a todos con todos diluye la estructura. Se conectó cada país con sus </w:t>
       </w:r>
       <m:oMath>
         <m:r>
@@ -14550,6 +14626,8 @@
       <w:r>
         <w:rPr>
           <w:lang w:val="es-CL"/>
+          <w:b/>
+          <w:bCs/>
         </w:rPr>
         <w:t xml:space="preserve">Elección de </w:t>
       </w:r>
@@ -14564,8 +14642,16 @@
       <w:r>
         <w:rPr>
           <w:lang w:val="es-CL"/>
-        </w:rPr>
-        <w:t xml:space="preserve"> y componentes conexas. Se eligió el menor </w:t>
+          <w:b/>
+          <w:bCs/>
+        </w:rPr>
+        <w:t xml:space="preserve"> y componentes conexas.</w:t>
+      </w:r>
+      <w:r>
+        <w:rPr>
+          <w:lang w:val="es-CL"/>
+        </w:rPr>
+        <w:t xml:space="preserve"> Se eligió el menor </w:t>
       </w:r>
       <m:oMath>
         <m:r>
@@ -14774,8 +14860,16 @@
       <w:r>
         <w:rPr>
           <w:lang w:val="es-CL"/>
-        </w:rPr>
-        <w:t xml:space="preserve">Atributos para evaluar. Para cada país se registró su continente, su idioma principal y su clima. El clima se definió según dónde vive la población: a cada ciudad de más de 15.000 habitantes </w:t>
+          <w:b/>
+          <w:bCs/>
+        </w:rPr>
+        <w:t xml:space="preserve">Atributos para evaluar.</w:t>
+      </w:r>
+      <w:r>
+        <w:rPr>
+          <w:lang w:val="es-CL"/>
+        </w:rPr>
+        <w:t xml:space="preserve"> Para cada país se registró su continente, su idioma principal y su clima. El clima se definió según dónde vive la población: a cada ciudad de más de 15.000 habitantes </w:t>
       </w:r>
       <w:r>
         <w:rPr>
@@ -15554,6 +15648,8 @@
       <w:r>
         <w:rPr>
           <w:lang w:val="es-CL"/>
+          <w:b/>
+          <w:bCs/>
         </w:rPr>
         <w:t xml:space="preserve">Espectro y </w:t>
       </w:r>
@@ -15562,14 +15658,24 @@
           <w:i/>
           <w:iCs/>
           <w:lang w:val="es-CL"/>
+          <w:b/>
+          <w:bCs/>
         </w:rPr>
         <w:t>eigengap</w:t>
       </w:r>
       <w:r>
         <w:rPr>
           <w:lang w:val="es-CL"/>
-        </w:rPr>
-        <w:t xml:space="preserve">. Los primeros valores propios de </w:t>
+          <w:b/>
+          <w:bCs/>
+        </w:rPr>
+        <w:t xml:space="preserve">.</w:t>
+      </w:r>
+      <w:r>
+        <w:rPr>
+          <w:lang w:val="es-CL"/>
+        </w:rPr>
+        <w:t xml:space="preserve"> Los primeros valores propios de </w:t>
       </w:r>
       <m:oMath>
         <m:sSub>
@@ -16139,8 +16245,16 @@
       <w:r>
         <w:rPr>
           <w:lang w:val="es-CL"/>
-        </w:rPr>
-        <w:t>Vector de Fiedler. Su signo separa exactamente a los 18 países hispanos del resto (Figura </w:t>
+          <w:b/>
+          <w:bCs/>
+        </w:rPr>
+        <w:t xml:space="preserve">Vector de Fiedler.</w:t>
+      </w:r>
+      <w:r>
+        <w:rPr>
+          <w:lang w:val="es-CL"/>
+        </w:rPr>
+        <w:t xml:space="preserve"> Su signo separa exactamente a los 18 países hispanos del resto (Figura </w:t>
       </w:r>
       <w:hyperlink w:anchor="fig:fiedler">
         <w:r>
@@ -16276,8 +16390,16 @@
       <w:r>
         <w:rPr>
           <w:lang w:val="es-CL"/>
-        </w:rPr>
-        <w:t xml:space="preserve">Comunidades. Con </w:t>
+          <w:b/>
+          <w:bCs/>
+        </w:rPr>
+        <w:t xml:space="preserve">Comunidades.</w:t>
+      </w:r>
+      <w:r>
+        <w:rPr>
+          <w:lang w:val="es-CL"/>
+        </w:rPr>
+        <w:t xml:space="preserve"> Con </w:t>
       </w:r>
       <m:oMath>
         <m:r>
@@ -16838,8 +16960,16 @@
       <w:r>
         <w:rPr>
           <w:lang w:val="es-CL"/>
-        </w:rPr>
-        <w:t xml:space="preserve">¿Idioma, geografía o clima? Se compararon las comunidades con cada atributo mediante el AMI (información mutua ajustada), que vale </w:t>
+          <w:b/>
+          <w:bCs/>
+        </w:rPr>
+        <w:t xml:space="preserve">¿Idioma, geografía o clima?</w:t>
+      </w:r>
+      <w:r>
+        <w:rPr>
+          <w:lang w:val="es-CL"/>
+        </w:rPr>
+        <w:t xml:space="preserve"> Se compararon las comunidades con cada atributo mediante el AMI (información mutua ajustada), que vale </w:t>
       </w:r>
       <m:oMath>
         <m:r>
@@ -18264,8 +18394,16 @@
       <w:r>
         <w:rPr>
           <w:lang w:val="es-CL"/>
-        </w:rPr>
-        <w:t>Chile y países puente. Chile está en el bloque hispano, y su país más parecido es Perú (</w:t>
+          <w:b/>
+          <w:bCs/>
+        </w:rPr>
+        <w:t xml:space="preserve">Chile y países puente.</w:t>
+      </w:r>
+      <w:r>
+        <w:rPr>
+          <w:lang w:val="es-CL"/>
+        </w:rPr>
+        <w:t xml:space="preserve"> Chile está en el bloque hispano, y su país más parecido es Perú (</w:t>
       </w:r>
       <m:oMath>
         <m:r>
@@ -18621,8 +18759,16 @@
       <w:r>
         <w:rPr>
           <w:lang w:val="es-CL"/>
-        </w:rPr>
-        <w:t>Experimento 1: Laplaciano no normalizado frente a normalizado (Tabla </w:t>
+          <w:b/>
+          <w:bCs/>
+        </w:rPr>
+        <w:t xml:space="preserve">Experimento 1: Laplaciano no normalizado frente a normalizado</w:t>
+      </w:r>
+      <w:r>
+        <w:rPr>
+          <w:lang w:val="es-CL"/>
+        </w:rPr>
+        <w:t xml:space="preserve"> (Tabla </w:t>
       </w:r>
       <w:hyperlink w:anchor="tab:e1">
         <w:r>
@@ -19314,8 +19460,16 @@
       <w:r>
         <w:rPr>
           <w:lang w:val="es-CL"/>
-        </w:rPr>
-        <w:t>Experimento 2: quitar los éxitos globales (Tabla </w:t>
+          <w:b/>
+          <w:bCs/>
+        </w:rPr>
+        <w:t xml:space="preserve">Experimento 2: quitar los éxitos globales</w:t>
+      </w:r>
+      <w:r>
+        <w:rPr>
+          <w:lang w:val="es-CL"/>
+        </w:rPr>
+        <w:t xml:space="preserve"> (Tabla </w:t>
       </w:r>
       <w:hyperlink w:anchor="tab:e2">
         <w:r>
@@ -20124,9 +20278,18 @@
       <w:r>
         <w:rPr>
           <w:lang w:val="es-CL"/>
+          <w:b/>
+          <w:bCs/>
         </w:rPr>
         <w:lastRenderedPageBreak/>
-        <w:t xml:space="preserve">Experimento 3: red con pesos frente a red sin pesos (Tabla 4). Se mantuvieron exactamente las mismas aristas, porque cada país sigue conectado con sus 12 países más parecidos, pero todas pasaron a valer 1. Con </w:t>
+        <w:t xml:space="preserve">Experimento 3: red con pesos frente a red sin pesos</w:t>
+      </w:r>
+      <w:r>
+        <w:rPr>
+          <w:lang w:val="es-CL"/>
+        </w:rPr>
+        <w:lastRenderedPageBreak/>
+        <w:t xml:space="preserve"> (Tabla 4). Se mantuvieron exactamente las mismas aristas, porque cada país sigue conectado con sus 12 países más parecidos, pero todas pasaron a valer 1. Con </w:t>
       </w:r>
       <m:oMath>
         <m:r>
@@ -21081,6 +21244,10 @@
         <w:pStyle w:val="FirstParagraph"/>
       </w:pPr>
       <w:r>
+        <w:rPr>
+          <w:b/>
+          <w:bCs/>
+        </w:rPr>
         <w:t>Limitaciones.</w:t>
       </w:r>
     </w:p>
@@ -21214,8 +21381,16 @@
       <w:r>
         <w:rPr>
           <w:lang w:val="es-CL"/>
-        </w:rPr>
-        <w:t>Extensión propuesta. Construir una red por mes (red temporal) para estudiar si las comunidades cambian a lo largo del año, por ejemplo con los éxitos de verano de cada hemisferio. También se podrían comparar los resultados con métodos que maximizan la modularidad, como Louvain.</w:t>
+          <w:b/>
+          <w:bCs/>
+        </w:rPr>
+        <w:t xml:space="preserve">Extensión propuesta.</w:t>
+      </w:r>
+      <w:r>
+        <w:rPr>
+          <w:lang w:val="es-CL"/>
+        </w:rPr>
+        <w:t xml:space="preserve"> Construir una red por mes (red temporal) para estudiar si las comunidades cambian a lo largo del año, por ejemplo con los éxitos de verano de cada hemisferio. También se podrían comparar los resultados con métodos que maximizan la modularidad, como Louvain.</w:t>
       </w:r>
     </w:p>
     <w:p>
@@ -21774,6 +21949,10 @@
         <w:pStyle w:val="FirstParagraph"/>
       </w:pPr>
       <w:r>
+        <w:rPr>
+          <w:b/>
+          <w:bCs/>
+        </w:rPr>
         <w:t>Modelo utilizado.</w:t>
       </w:r>
     </w:p>
@@ -21828,6 +22007,10 @@
         <w:pStyle w:val="FirstParagraph"/>
       </w:pPr>
       <w:r>
+        <w:rPr>
+          <w:b/>
+          <w:bCs/>
+        </w:rPr>
         <w:t>Modalidad de uso.</w:t>
       </w:r>
     </w:p>
@@ -21899,8 +22082,16 @@
       <w:r>
         <w:rPr>
           <w:lang w:val="es-CL"/>
-        </w:rPr>
-        <w:t>Uso de las respuestas. Los prompts se agrupan según las etapas del trabajo. Para cada conjunto se indica qué se le pidió a la herramienta y en qué parte del informe o del código se usaron sus respuestas.</w:t>
+          <w:b/>
+          <w:bCs/>
+        </w:rPr>
+        <w:t xml:space="preserve">Uso de las respuestas.</w:t>
+      </w:r>
+      <w:r>
+        <w:rPr>
+          <w:lang w:val="es-CL"/>
+        </w:rPr>
+        <w:t xml:space="preserve"> Los prompts se agrupan según las etapas del trabajo. Para cada conjunto se indica qué se le pidió a la herramienta y en qué parte del informe o del código se usaron sus respuestas.</w:t>
       </w:r>
     </w:p>
     <w:p>
@@ -21916,8 +22107,16 @@
       <w:r>
         <w:rPr>
           <w:lang w:val="es-CL"/>
-        </w:rPr>
-        <w:t xml:space="preserve">Comprensión del enunciado y elección de los datos. Se pidió explicar los requisitos del trabajo y los criterios para elegir una base de datos y una pregunta de análisis, proponer bases de datos posibles. </w:t>
+          <w:b/>
+          <w:bCs/>
+        </w:rPr>
+        <w:t xml:space="preserve">Comprensión del enunciado y elección de los datos.</w:t>
+      </w:r>
+      <w:r>
+        <w:rPr>
+          <w:lang w:val="es-CL"/>
+        </w:rPr>
+        <w:t xml:space="preserve"> Se pidió explicar los requisitos del trabajo y los criterios para elegir una base de datos y una pregunta de análisis, proponer bases de datos posibles. </w:t>
       </w:r>
       <w:r>
         <w:rPr>
@@ -21944,8 +22143,16 @@
       <w:r>
         <w:rPr>
           <w:lang w:val="es-CL"/>
-        </w:rPr>
-        <w:t xml:space="preserve">Decisiones metodológicas. Se pidió aclarar la estructura de los datos (el Top 50 cambia cada día), excluir el Top 50 Global, usar todo el período y definir el clima de cada país según dónde vive su población, con la categoría “Variado” solo para países imposibles de encasillar. </w:t>
+          <w:b/>
+          <w:bCs/>
+        </w:rPr>
+        <w:t xml:space="preserve">Decisiones metodológicas.</w:t>
+      </w:r>
+      <w:r>
+        <w:rPr>
+          <w:lang w:val="es-CL"/>
+        </w:rPr>
+        <w:t xml:space="preserve"> Se pidió aclarar la estructura de los datos (el Top 50 cambia cada día), excluir el Top 50 Global, usar todo el período y definir el clima de cada país según dónde vive su población, con la categoría “Variado” solo para países imposibles de encasillar. </w:t>
       </w:r>
       <w:r>
         <w:rPr>
@@ -21978,8 +22185,16 @@
       <w:r>
         <w:rPr>
           <w:lang w:val="es-CL"/>
-        </w:rPr>
-        <w:t xml:space="preserve">Código y visualizaciones. Se pidió desarrollar el notebook en Python: descarga y limpieza de los datos, cálculo del clima, construcción de la red, implementación del clustering espectral, experimentos y gráficos (componentes conexas, espectro y </w:t>
+          <w:b/>
+          <w:bCs/>
+        </w:rPr>
+        <w:t xml:space="preserve">Código y visualizaciones.</w:t>
+      </w:r>
+      <w:r>
+        <w:rPr>
+          <w:lang w:val="es-CL"/>
+        </w:rPr>
+        <w:t xml:space="preserve"> Se pidió desarrollar el notebook en Python: descarga y limpieza de los datos, cálculo del clima, construcción de la red, implementación del clustering espectral, experimentos y gráficos (componentes conexas, espectro y </w:t>
       </w:r>
       <w:r>
         <w:rPr>
@@ -22023,8 +22238,16 @@
       <w:r>
         <w:rPr>
           <w:lang w:val="es-CL"/>
-        </w:rPr>
-        <w:t xml:space="preserve">Redacción del informe. Se pidió </w:t>
+          <w:b/>
+          <w:bCs/>
+        </w:rPr>
+        <w:t xml:space="preserve">Redacción del informe.</w:t>
+      </w:r>
+      <w:r>
+        <w:rPr>
+          <w:lang w:val="es-CL"/>
+        </w:rPr>
+        <w:t xml:space="preserve"> Se pidió </w:t>
       </w:r>
       <w:r>
         <w:rPr>
@@ -22044,9 +22267,17 @@
         <w:pStyle w:val="FirstParagraph"/>
       </w:pPr>
       <w:r>
+        <w:rPr>
+          <w:b/>
+          <w:bCs/>
+        </w:rPr>
         <w:t>P</w:t>
       </w:r>
       <w:r>
+        <w:rPr>
+          <w:b/>
+          <w:bCs/>
+        </w:rPr>
         <w:t>rompts utilizados.</w:t>
       </w:r>
     </w:p>
@@ -22359,6 +22590,46 @@
       </w:r>
       <w:r>
         <w:t>Resume los resultados en una tabla.”</w:t>
+      </w:r>
+    </w:p>
+    <w:p>
+      <w:pPr>
+        <w:numPr>
+          <w:ilvl w:val="0"/>
+          <w:numId w:val="18"/>
+        </w:numPr>
+        <w:rPr>
+          <w:lang w:val="es-CL"/>
+        </w:rPr>
+      </w:pPr>
+      <w:r>
+        <w:rPr>
+          <w:lang w:val="es-CL"/>
+        </w:rPr>
+        <w:t>“Ayudame con al redaccion de l</w:t>
+      </w:r>
+      <w:r>
+        <w:rPr>
+          <w:lang w:val="es-CL"/>
+        </w:rPr>
+        <w:t>a siguiente sección”</w:t>
+      </w:r>
+    </w:p>
+    <w:p>
+      <w:pPr>
+        <w:numPr>
+          <w:ilvl w:val="0"/>
+          <w:numId w:val="18"/>
+        </w:numPr>
+        <w:rPr>
+          <w:lang w:val="es-CL"/>
+        </w:rPr>
+      </w:pPr>
+      <w:r>
+        <w:rPr>
+          <w:lang w:val="es-CL"/>
+        </w:rPr>
+        <w:t>“Pon la información de todas las imágenes de los gráficos.”</w:t>
       </w:r>
     </w:p>
     <w:sectPr>

</xml_diff>